<commit_message>
docs(oak): leave missing photo cells blank in 10-31 report
Placeholder text in activity cells looked unfinished. Missing slots are
now empty; the generator still prints the expected filenames so photos
05-09 can be dropped in later and the docx rebuilt.

Co-Authored-By: Claude Opus 5.5 <noreply@anthropic.com>
</commit_message>
<xml_diff>
--- a/docs/전달용/OAK시험_20261031/세팅작업_보고서_OAK_20261031.docx
+++ b/docs/전달용/OAK시험_20261031/세팅작업_보고서_OAK_20261031.docx
@@ -879,9 +879,7 @@
               <w:rPr/>
             </w:pPr>
             <w:r>
-              <w:t xml:space="preserve">📷 사진 대기</w:t>
-              <w:br/>
-              <w:t xml:space="preserve">05_PoE어댑터_OAK_랜선연결.jpg</w:t>
+              <w:t xml:space="preserve"/>
             </w:r>
           </w:p>
         </w:tc>
@@ -1024,9 +1022,7 @@
               <w:rPr/>
             </w:pPr>
             <w:r>
-              <w:t xml:space="preserve">📷 사진 대기</w:t>
-              <w:br/>
-              <w:t xml:space="preserve">06_노트북_랜어댑터_허브.jpg</w:t>
+              <w:t xml:space="preserve"/>
             </w:r>
           </w:p>
         </w:tc>
@@ -1368,9 +1364,7 @@
               <w:rPr/>
             </w:pPr>
             <w:r>
-              <w:t xml:space="preserve">📷 사진 대기</w:t>
-              <w:br/>
-              <w:t xml:space="preserve">07_마스트위_OAK외관.jpg</w:t>
+              <w:t xml:space="preserve"/>
             </w:r>
           </w:p>
         </w:tc>
@@ -3188,9 +3182,7 @@
               <w:rPr/>
             </w:pPr>
             <w:r>
-              <w:t xml:space="preserve">📷 사진 대기</w:t>
-              <w:br/>
-              <w:t xml:space="preserve">08_퓨즈홀더_배터리분기점.jpg</w:t>
+              <w:t xml:space="preserve"/>
             </w:r>
           </w:p>
         </w:tc>
@@ -3333,9 +3325,7 @@
               <w:rPr/>
             </w:pPr>
             <w:r>
-              <w:t xml:space="preserve">📷 사진 대기</w:t>
-              <w:br/>
-              <w:t xml:space="preserve">09_5V모듈_UH308결선.jpg</w:t>
+              <w:t xml:space="preserve"/>
             </w:r>
           </w:p>
         </w:tc>

</xml_diff>